<commit_message>
[PC] PID book redesign plan and paper edits
Co-Authored-By: Claude Sonnet 5.5 <noreply@anthropic.com>
</commit_message>
<xml_diff>
--- a/Documents/Paper/paper_Tan_Huy.docx
+++ b/Documents/Paper/paper_Tan_Huy.docx
@@ -101,7 +101,25 @@
       </w:pPr>
       <w:r>
         <w:rPr/>
-        <w:t>The steering feel of a column electric power steering (C-EPS) system is set by an assist map and a compensator calibrated for each vehicle on a dry road. Because the map has no target to compare with, a change of the road-reaction torque is attenuated only by the factor 1/(1+s), where s is the local map slope, which stability and noise keep small. This study adds torque feedback to a calibrated map without changing it. A PID branch acts on the error between the measured torque and a target defined from vehicle speed and lateral acceleration, without friction estimation, in parallel with the map and its compensator; only its four parameters are tuned for each vehicle. A steady-state analysis shows that it removes the torque error for any monotonic map while the actuator is unsaturated. The lead–lag-compensated map (Map), a PID controller that replaces the map (PID), and the plug-in combination (MapPID) are compared on a nonlinear C-EPS–vehicle model with tire saturation, motor dynamics, and sensor noise, with common gates and Pareto-based parameter selection. In independent cornering, friction-change, and weaving scenarios, the RMS torque error of Map is 3.3 to 8.1 times that of the feedback controllers, reaching 32 % of the reference in held turns and 87 % in lane changes. MapPID tracks like PID in cornering and within 7 % and 36 % of it in friction change and weaving, while its high-frequency assist torque is 30 to 38 % lower. The results come from one simulated vehicle.</w:t>
+        <w:t>In a column electric power steering (C-EPS) system, a motor helps the driver turn the wheel. An assist map and a compensator, set for each vehicle on a dry road, decide how much help the motor gives. The map uses only the torque measured at the torsion bar and has no target torque. When the road reaction torque changes, for example with grip loss, column friction, or fast steering, the map reduces the torque error only a little. A steeper map would help, but it reduces stability and increases sensor noise. This study adds torque feedback to the existing map.</w:t>
+      </w:r>
+    </w:p>
+    <w:p>
+      <w:pPr>
+        <w:ind w:firstLine="720"/>
+      </w:pPr>
+      <w:r>
+        <w:rPr/>
+        <w:t>Map is the assist map with a lead–lag compensator and represents the vehicle's existing controller. PID has no map; it controls the difference between the measured torque and a target torque from vehicle speed and lateral acceleration. MapPID keeps Map and adds a PID controller beside it, working on the same difference. Only the PID parameters are tuned for each vehicle. The analysis shows that the added PID controller removes the steady error when the motor is not at its limit.</w:t>
+      </w:r>
+    </w:p>
+    <w:p>
+      <w:pPr>
+        <w:ind w:firstLine="720"/>
+      </w:pPr>
+      <w:r>
+        <w:rPr/>
+        <w:t>Tests use a model of the steering and vehicle with tire saturation and sensor noise. Map has large errors near its slope limit and in fast steering. PID and MapPID remove the steady error. At low torque, MapPID gives less noisy assist than PID, because the map supplies part of the gain, but it tracks worse in fast steering. Only one simulated vehicle is used.</w:t>
       </w:r>
     </w:p>
     <w:p>

</xml_diff>